<commit_message>
Schéma : encadré redondant « Unisanté » remplacé par l'Université de Lausanne (co-surveillance) ; V6 régénérée
Co-Authored-By: Claude Opus 5.5 <noreply@anthropic.com>
Claude-Session: https://claude.ai/code/session_01BMtPhiCmF4fJJwSAqbwbtJ
</commit_message>
<xml_diff>
--- a/Redaction/Audit_CTMG_V6.docx
+++ b/Redaction/Audit_CTMG_V6.docx
@@ -191,7 +191,7 @@
             </w:rPr>
             <w:fldChar w:fldCharType="separate"/>
           </w:r>
-          <w:hyperlink w:anchor="__RefHeading___Toc1104_4270659813">
+          <w:hyperlink w:anchor="__RefHeading___Toc1104_1191148386">
             <w:r>
               <w:rPr>
                 <w:rStyle w:val="IndexLink"/>
@@ -211,7 +211,7 @@
             </w:tabs>
             <w:rPr/>
           </w:pPr>
-          <w:hyperlink w:anchor="__RefHeading___Toc1106_4270659813">
+          <w:hyperlink w:anchor="__RefHeading___Toc1106_1191148386">
             <w:r>
               <w:rPr>
                 <w:rStyle w:val="IndexLink"/>
@@ -231,7 +231,7 @@
             </w:tabs>
             <w:rPr/>
           </w:pPr>
-          <w:hyperlink w:anchor="__RefHeading___Toc1108_4270659813">
+          <w:hyperlink w:anchor="__RefHeading___Toc1108_1191148386">
             <w:r>
               <w:rPr>
                 <w:rStyle w:val="IndexLink"/>
@@ -251,7 +251,7 @@
             </w:tabs>
             <w:rPr/>
           </w:pPr>
-          <w:hyperlink w:anchor="__RefHeading___Toc1110_4270659813">
+          <w:hyperlink w:anchor="__RefHeading___Toc1110_1191148386">
             <w:r>
               <w:rPr>
                 <w:rStyle w:val="IndexLink"/>
@@ -271,7 +271,7 @@
             </w:tabs>
             <w:rPr/>
           </w:pPr>
-          <w:hyperlink w:anchor="__RefHeading___Toc1112_4270659813">
+          <w:hyperlink w:anchor="__RefHeading___Toc1112_1191148386">
             <w:r>
               <w:rPr>
                 <w:rStyle w:val="IndexLink"/>
@@ -291,7 +291,7 @@
             </w:tabs>
             <w:rPr/>
           </w:pPr>
-          <w:hyperlink w:anchor="__RefHeading___Toc1114_4270659813">
+          <w:hyperlink w:anchor="__RefHeading___Toc1114_1191148386">
             <w:r>
               <w:rPr>
                 <w:rStyle w:val="IndexLink"/>
@@ -311,7 +311,7 @@
             </w:tabs>
             <w:rPr/>
           </w:pPr>
-          <w:hyperlink w:anchor="__RefHeading___Toc1116_4270659813">
+          <w:hyperlink w:anchor="__RefHeading___Toc1116_1191148386">
             <w:r>
               <w:rPr>
                 <w:rStyle w:val="IndexLink"/>
@@ -331,7 +331,7 @@
             </w:tabs>
             <w:rPr/>
           </w:pPr>
-          <w:hyperlink w:anchor="__RefHeading___Toc1118_4270659813">
+          <w:hyperlink w:anchor="__RefHeading___Toc1118_1191148386">
             <w:r>
               <w:rPr>
                 <w:rStyle w:val="IndexLink"/>
@@ -351,7 +351,7 @@
             </w:tabs>
             <w:rPr/>
           </w:pPr>
-          <w:hyperlink w:anchor="__RefHeading___Toc1120_4270659813">
+          <w:hyperlink w:anchor="__RefHeading___Toc1120_1191148386">
             <w:r>
               <w:rPr>
                 <w:rStyle w:val="IndexLink"/>
@@ -371,7 +371,7 @@
             </w:tabs>
             <w:rPr/>
           </w:pPr>
-          <w:hyperlink w:anchor="__RefHeading___Toc1122_4270659813">
+          <w:hyperlink w:anchor="__RefHeading___Toc1122_1191148386">
             <w:r>
               <w:rPr>
                 <w:rStyle w:val="IndexLink"/>
@@ -391,7 +391,7 @@
             </w:tabs>
             <w:rPr/>
           </w:pPr>
-          <w:hyperlink w:anchor="__RefHeading___Toc1124_4270659813">
+          <w:hyperlink w:anchor="__RefHeading___Toc1124_1191148386">
             <w:r>
               <w:rPr>
                 <w:rStyle w:val="IndexLink"/>
@@ -411,7 +411,7 @@
             </w:tabs>
             <w:rPr/>
           </w:pPr>
-          <w:hyperlink w:anchor="__RefHeading___Toc1126_4270659813">
+          <w:hyperlink w:anchor="__RefHeading___Toc1126_1191148386">
             <w:r>
               <w:rPr>
                 <w:rStyle w:val="IndexLink"/>
@@ -431,7 +431,7 @@
             </w:tabs>
             <w:rPr/>
           </w:pPr>
-          <w:hyperlink w:anchor="__RefHeading___Toc1128_4270659813">
+          <w:hyperlink w:anchor="__RefHeading___Toc1128_1191148386">
             <w:r>
               <w:rPr>
                 <w:rStyle w:val="IndexLink"/>
@@ -451,7 +451,7 @@
             </w:tabs>
             <w:rPr/>
           </w:pPr>
-          <w:hyperlink w:anchor="__RefHeading___Toc1130_4270659813">
+          <w:hyperlink w:anchor="__RefHeading___Toc1130_1191148386">
             <w:r>
               <w:rPr>
                 <w:rStyle w:val="IndexLink"/>
@@ -471,7 +471,7 @@
             </w:tabs>
             <w:rPr/>
           </w:pPr>
-          <w:hyperlink w:anchor="__RefHeading___Toc1132_4270659813">
+          <w:hyperlink w:anchor="__RefHeading___Toc1132_1191148386">
             <w:r>
               <w:rPr>
                 <w:rStyle w:val="IndexLink"/>
@@ -491,7 +491,7 @@
             </w:tabs>
             <w:rPr/>
           </w:pPr>
-          <w:hyperlink w:anchor="__RefHeading___Toc1134_4270659813">
+          <w:hyperlink w:anchor="__RefHeading___Toc1134_1191148386">
             <w:r>
               <w:rPr>
                 <w:rStyle w:val="IndexLink"/>
@@ -511,7 +511,7 @@
             </w:tabs>
             <w:rPr/>
           </w:pPr>
-          <w:hyperlink w:anchor="__RefHeading___Toc1136_4270659813">
+          <w:hyperlink w:anchor="__RefHeading___Toc1136_1191148386">
             <w:r>
               <w:rPr>
                 <w:rStyle w:val="IndexLink"/>
@@ -531,7 +531,7 @@
             </w:tabs>
             <w:rPr/>
           </w:pPr>
-          <w:hyperlink w:anchor="__RefHeading___Toc1138_4270659813">
+          <w:hyperlink w:anchor="__RefHeading___Toc1138_1191148386">
             <w:r>
               <w:rPr>
                 <w:rStyle w:val="IndexLink"/>
@@ -551,7 +551,7 @@
             </w:tabs>
             <w:rPr/>
           </w:pPr>
-          <w:hyperlink w:anchor="__RefHeading___Toc1140_4270659813">
+          <w:hyperlink w:anchor="__RefHeading___Toc1140_1191148386">
             <w:r>
               <w:rPr>
                 <w:rStyle w:val="IndexLink"/>
@@ -571,7 +571,7 @@
             </w:tabs>
             <w:rPr/>
           </w:pPr>
-          <w:hyperlink w:anchor="__RefHeading___Toc1142_4270659813">
+          <w:hyperlink w:anchor="__RefHeading___Toc1142_1191148386">
             <w:r>
               <w:rPr>
                 <w:rStyle w:val="IndexLink"/>
@@ -591,7 +591,7 @@
             </w:tabs>
             <w:rPr/>
           </w:pPr>
-          <w:hyperlink w:anchor="__RefHeading___Toc1144_4270659813">
+          <w:hyperlink w:anchor="__RefHeading___Toc1144_1191148386">
             <w:r>
               <w:rPr>
                 <w:rStyle w:val="IndexLink"/>
@@ -611,7 +611,7 @@
             </w:tabs>
             <w:rPr/>
           </w:pPr>
-          <w:hyperlink w:anchor="__RefHeading___Toc1146_4270659813">
+          <w:hyperlink w:anchor="__RefHeading___Toc1146_1191148386">
             <w:r>
               <w:rPr>
                 <w:rStyle w:val="IndexLink"/>
@@ -631,7 +631,7 @@
             </w:tabs>
             <w:rPr/>
           </w:pPr>
-          <w:hyperlink w:anchor="__RefHeading___Toc1148_4270659813">
+          <w:hyperlink w:anchor="__RefHeading___Toc1148_1191148386">
             <w:r>
               <w:rPr>
                 <w:rStyle w:val="IndexLink"/>
@@ -651,7 +651,7 @@
             </w:tabs>
             <w:rPr/>
           </w:pPr>
-          <w:hyperlink w:anchor="__RefHeading___Toc1150_4270659813">
+          <w:hyperlink w:anchor="__RefHeading___Toc1150_1191148386">
             <w:r>
               <w:rPr>
                 <w:rStyle w:val="IndexLink"/>
@@ -671,7 +671,7 @@
             </w:tabs>
             <w:rPr/>
           </w:pPr>
-          <w:hyperlink w:anchor="__RefHeading___Toc1152_4270659813">
+          <w:hyperlink w:anchor="__RefHeading___Toc1152_1191148386">
             <w:r>
               <w:rPr>
                 <w:rStyle w:val="IndexLink"/>
@@ -691,7 +691,7 @@
             </w:tabs>
             <w:rPr/>
           </w:pPr>
-          <w:hyperlink w:anchor="__RefHeading___Toc1154_4270659813">
+          <w:hyperlink w:anchor="__RefHeading___Toc1154_1191148386">
             <w:r>
               <w:rPr>
                 <w:rStyle w:val="IndexLink"/>
@@ -711,7 +711,7 @@
             </w:tabs>
             <w:rPr/>
           </w:pPr>
-          <w:hyperlink w:anchor="__RefHeading___Toc1156_4270659813">
+          <w:hyperlink w:anchor="__RefHeading___Toc1156_1191148386">
             <w:r>
               <w:rPr>
                 <w:rStyle w:val="IndexLink"/>
@@ -731,7 +731,7 @@
             </w:tabs>
             <w:rPr/>
           </w:pPr>
-          <w:hyperlink w:anchor="__RefHeading___Toc1158_4270659813">
+          <w:hyperlink w:anchor="__RefHeading___Toc1158_1191148386">
             <w:r>
               <w:rPr>
                 <w:rStyle w:val="IndexLink"/>
@@ -751,7 +751,7 @@
             </w:tabs>
             <w:rPr/>
           </w:pPr>
-          <w:hyperlink w:anchor="__RefHeading___Toc1160_4270659813">
+          <w:hyperlink w:anchor="__RefHeading___Toc1160_1191148386">
             <w:r>
               <w:rPr>
                 <w:rStyle w:val="IndexLink"/>
@@ -771,7 +771,7 @@
             </w:tabs>
             <w:rPr/>
           </w:pPr>
-          <w:hyperlink w:anchor="__RefHeading___Toc1162_4270659813">
+          <w:hyperlink w:anchor="__RefHeading___Toc1162_1191148386">
             <w:r>
               <w:rPr>
                 <w:rStyle w:val="IndexLink"/>
@@ -791,7 +791,7 @@
             </w:tabs>
             <w:rPr/>
           </w:pPr>
-          <w:hyperlink w:anchor="__RefHeading___Toc1164_4270659813">
+          <w:hyperlink w:anchor="__RefHeading___Toc1164_1191148386">
             <w:r>
               <w:rPr>
                 <w:rStyle w:val="IndexLink"/>
@@ -811,7 +811,7 @@
             </w:tabs>
             <w:rPr/>
           </w:pPr>
-          <w:hyperlink w:anchor="__RefHeading___Toc1166_4270659813">
+          <w:hyperlink w:anchor="__RefHeading___Toc1166_1191148386">
             <w:r>
               <w:rPr>
                 <w:rStyle w:val="IndexLink"/>
@@ -831,7 +831,7 @@
             </w:tabs>
             <w:rPr/>
           </w:pPr>
-          <w:hyperlink w:anchor="__RefHeading___Toc1168_4270659813">
+          <w:hyperlink w:anchor="__RefHeading___Toc1168_1191148386">
             <w:r>
               <w:rPr>
                 <w:rStyle w:val="IndexLink"/>
@@ -851,7 +851,7 @@
             </w:tabs>
             <w:rPr/>
           </w:pPr>
-          <w:hyperlink w:anchor="__RefHeading___Toc1170_4270659813">
+          <w:hyperlink w:anchor="__RefHeading___Toc1170_1191148386">
             <w:r>
               <w:rPr>
                 <w:rStyle w:val="IndexLink"/>
@@ -871,7 +871,7 @@
             </w:tabs>
             <w:rPr/>
           </w:pPr>
-          <w:hyperlink w:anchor="__RefHeading___Toc1172_4270659813">
+          <w:hyperlink w:anchor="__RefHeading___Toc1172_1191148386">
             <w:r>
               <w:rPr>
                 <w:rStyle w:val="IndexLink"/>
@@ -891,7 +891,7 @@
             </w:tabs>
             <w:rPr/>
           </w:pPr>
-          <w:hyperlink w:anchor="__RefHeading___Toc1174_4270659813">
+          <w:hyperlink w:anchor="__RefHeading___Toc1174_1191148386">
             <w:r>
               <w:rPr>
                 <w:rStyle w:val="IndexLink"/>
@@ -911,7 +911,7 @@
             </w:tabs>
             <w:rPr/>
           </w:pPr>
-          <w:hyperlink w:anchor="__RefHeading___Toc1176_4270659813">
+          <w:hyperlink w:anchor="__RefHeading___Toc1176_1191148386">
             <w:r>
               <w:rPr>
                 <w:rStyle w:val="IndexLink"/>
@@ -931,7 +931,7 @@
             </w:tabs>
             <w:rPr/>
           </w:pPr>
-          <w:hyperlink w:anchor="__RefHeading___Toc1178_4270659813">
+          <w:hyperlink w:anchor="__RefHeading___Toc1178_1191148386">
             <w:r>
               <w:rPr>
                 <w:rStyle w:val="IndexLink"/>
@@ -951,7 +951,7 @@
             </w:tabs>
             <w:rPr/>
           </w:pPr>
-          <w:hyperlink w:anchor="__RefHeading___Toc1180_4270659813">
+          <w:hyperlink w:anchor="__RefHeading___Toc1180_1191148386">
             <w:r>
               <w:rPr>
                 <w:rStyle w:val="IndexLink"/>
@@ -971,7 +971,7 @@
             </w:tabs>
             <w:rPr/>
           </w:pPr>
-          <w:hyperlink w:anchor="__RefHeading___Toc1182_4270659813">
+          <w:hyperlink w:anchor="__RefHeading___Toc1182_1191148386">
             <w:r>
               <w:rPr>
                 <w:rStyle w:val="IndexLink"/>
@@ -991,7 +991,7 @@
             </w:tabs>
             <w:rPr/>
           </w:pPr>
-          <w:hyperlink w:anchor="__RefHeading___Toc1184_4270659813">
+          <w:hyperlink w:anchor="__RefHeading___Toc1184_1191148386">
             <w:r>
               <w:rPr>
                 <w:rStyle w:val="IndexLink"/>
@@ -1047,7 +1047,7 @@
         <w:spacing w:before="0" w:after="80"/>
         <w:rPr/>
       </w:pPr>
-      <w:bookmarkStart w:id="0" w:name="__RefHeading___Toc1104_4270659813"/>
+      <w:bookmarkStart w:id="0" w:name="__RefHeading___Toc1104_1191148386"/>
       <w:bookmarkEnd w:id="0"/>
       <w:r>
         <w:rPr/>
@@ -1137,7 +1137,7 @@
         <w:pStyle w:val="Heading1"/>
         <w:rPr/>
       </w:pPr>
-      <w:bookmarkStart w:id="1" w:name="__RefHeading___Toc1106_4270659813"/>
+      <w:bookmarkStart w:id="1" w:name="__RefHeading___Toc1106_1191148386"/>
       <w:bookmarkEnd w:id="1"/>
       <w:r>
         <w:rPr/>
@@ -1149,7 +1149,7 @@
         <w:pStyle w:val="Heading2"/>
         <w:rPr/>
       </w:pPr>
-      <w:bookmarkStart w:id="2" w:name="__RefHeading___Toc1108_4270659813"/>
+      <w:bookmarkStart w:id="2" w:name="__RefHeading___Toc1108_1191148386"/>
       <w:bookmarkEnd w:id="2"/>
       <w:r>
         <w:rPr/>
@@ -1181,7 +1181,7 @@
         <w:pStyle w:val="Heading2"/>
         <w:rPr/>
       </w:pPr>
-      <w:bookmarkStart w:id="3" w:name="__RefHeading___Toc1110_4270659813"/>
+      <w:bookmarkStart w:id="3" w:name="__RefHeading___Toc1110_1191148386"/>
       <w:bookmarkEnd w:id="3"/>
       <w:r>
         <w:rPr/>
@@ -1213,7 +1213,7 @@
         <w:pStyle w:val="Heading2"/>
         <w:rPr/>
       </w:pPr>
-      <w:bookmarkStart w:id="4" w:name="__RefHeading___Toc1112_4270659813"/>
+      <w:bookmarkStart w:id="4" w:name="__RefHeading___Toc1112_1191148386"/>
       <w:bookmarkEnd w:id="4"/>
       <w:r>
         <w:rPr/>
@@ -1235,7 +1235,7 @@
         <w:pStyle w:val="Heading2"/>
         <w:rPr/>
       </w:pPr>
-      <w:bookmarkStart w:id="5" w:name="__RefHeading___Toc1114_4270659813"/>
+      <w:bookmarkStart w:id="5" w:name="__RefHeading___Toc1114_1191148386"/>
       <w:bookmarkEnd w:id="5"/>
       <w:r>
         <w:rPr/>
@@ -1257,7 +1257,7 @@
         <w:pStyle w:val="Heading1"/>
         <w:rPr/>
       </w:pPr>
-      <w:bookmarkStart w:id="6" w:name="__RefHeading___Toc1116_4270659813"/>
+      <w:bookmarkStart w:id="6" w:name="__RefHeading___Toc1116_1191148386"/>
       <w:bookmarkEnd w:id="6"/>
       <w:r>
         <w:rPr/>
@@ -1269,7 +1269,7 @@
         <w:pStyle w:val="Heading2"/>
         <w:rPr/>
       </w:pPr>
-      <w:bookmarkStart w:id="7" w:name="__RefHeading___Toc1118_4270659813"/>
+      <w:bookmarkStart w:id="7" w:name="__RefHeading___Toc1118_1191148386"/>
       <w:bookmarkEnd w:id="7"/>
       <w:r>
         <w:rPr/>
@@ -1339,7 +1339,7 @@
         <w:pStyle w:val="Heading2"/>
         <w:rPr/>
       </w:pPr>
-      <w:bookmarkStart w:id="8" w:name="__RefHeading___Toc1120_4270659813"/>
+      <w:bookmarkStart w:id="8" w:name="__RefHeading___Toc1120_1191148386"/>
       <w:bookmarkEnd w:id="8"/>
       <w:r>
         <w:rPr/>
@@ -1371,7 +1371,7 @@
         <w:pStyle w:val="Heading1"/>
         <w:rPr/>
       </w:pPr>
-      <w:bookmarkStart w:id="9" w:name="__RefHeading___Toc1122_4270659813"/>
+      <w:bookmarkStart w:id="9" w:name="__RefHeading___Toc1122_1191148386"/>
       <w:bookmarkEnd w:id="9"/>
       <w:r>
         <w:rPr/>
@@ -1383,7 +1383,7 @@
         <w:pStyle w:val="Heading2"/>
         <w:rPr/>
       </w:pPr>
-      <w:bookmarkStart w:id="10" w:name="__RefHeading___Toc1124_4270659813"/>
+      <w:bookmarkStart w:id="10" w:name="__RefHeading___Toc1124_1191148386"/>
       <w:bookmarkEnd w:id="10"/>
       <w:r>
         <w:rPr/>
@@ -1405,7 +1405,7 @@
         <w:pStyle w:val="Heading2"/>
         <w:rPr/>
       </w:pPr>
-      <w:bookmarkStart w:id="11" w:name="__RefHeading___Toc1126_4270659813"/>
+      <w:bookmarkStart w:id="11" w:name="__RefHeading___Toc1126_1191148386"/>
       <w:bookmarkEnd w:id="11"/>
       <w:r>
         <w:rPr/>
@@ -1457,7 +1457,7 @@
         <w:pStyle w:val="Heading2"/>
         <w:rPr/>
       </w:pPr>
-      <w:bookmarkStart w:id="12" w:name="__RefHeading___Toc1128_4270659813"/>
+      <w:bookmarkStart w:id="12" w:name="__RefHeading___Toc1128_1191148386"/>
       <w:bookmarkEnd w:id="12"/>
       <w:r>
         <w:rPr/>
@@ -1543,7 +1543,7 @@
         <w:pStyle w:val="Heading1"/>
         <w:rPr/>
       </w:pPr>
-      <w:bookmarkStart w:id="13" w:name="__RefHeading___Toc1130_4270659813"/>
+      <w:bookmarkStart w:id="13" w:name="__RefHeading___Toc1130_1191148386"/>
       <w:bookmarkEnd w:id="13"/>
       <w:r>
         <w:rPr/>
@@ -1555,7 +1555,7 @@
         <w:pStyle w:val="Heading2"/>
         <w:rPr/>
       </w:pPr>
-      <w:bookmarkStart w:id="14" w:name="__RefHeading___Toc1132_4270659813"/>
+      <w:bookmarkStart w:id="14" w:name="__RefHeading___Toc1132_1191148386"/>
       <w:bookmarkEnd w:id="14"/>
       <w:r>
         <w:rPr/>
@@ -2296,7 +2296,7 @@
         <w:pStyle w:val="Heading2"/>
         <w:rPr/>
       </w:pPr>
-      <w:bookmarkStart w:id="15" w:name="__RefHeading___Toc1134_4270659813"/>
+      <w:bookmarkStart w:id="15" w:name="__RefHeading___Toc1134_1191148386"/>
       <w:bookmarkEnd w:id="15"/>
       <w:r>
         <w:rPr/>
@@ -2358,7 +2358,7 @@
         <w:pStyle w:val="Heading2"/>
         <w:rPr/>
       </w:pPr>
-      <w:bookmarkStart w:id="16" w:name="__RefHeading___Toc1136_4270659813"/>
+      <w:bookmarkStart w:id="16" w:name="__RefHeading___Toc1136_1191148386"/>
       <w:bookmarkEnd w:id="16"/>
       <w:r>
         <w:rPr/>
@@ -2410,7 +2410,7 @@
         <w:pStyle w:val="Heading1"/>
         <w:rPr/>
       </w:pPr>
-      <w:bookmarkStart w:id="17" w:name="__RefHeading___Toc1138_4270659813"/>
+      <w:bookmarkStart w:id="17" w:name="__RefHeading___Toc1138_1191148386"/>
       <w:bookmarkEnd w:id="17"/>
       <w:r>
         <w:rPr/>
@@ -2432,7 +2432,7 @@
         <w:pStyle w:val="Heading2"/>
         <w:rPr/>
       </w:pPr>
-      <w:bookmarkStart w:id="18" w:name="__RefHeading___Toc1140_4270659813"/>
+      <w:bookmarkStart w:id="18" w:name="__RefHeading___Toc1140_1191148386"/>
       <w:bookmarkEnd w:id="18"/>
       <w:r>
         <w:rPr/>
@@ -2464,7 +2464,7 @@
         <w:pStyle w:val="Heading2"/>
         <w:rPr/>
       </w:pPr>
-      <w:bookmarkStart w:id="19" w:name="__RefHeading___Toc1142_4270659813"/>
+      <w:bookmarkStart w:id="19" w:name="__RefHeading___Toc1142_1191148386"/>
       <w:bookmarkEnd w:id="19"/>
       <w:r>
         <w:rPr/>
@@ -2486,7 +2486,7 @@
         <w:pStyle w:val="Heading2"/>
         <w:rPr/>
       </w:pPr>
-      <w:bookmarkStart w:id="20" w:name="__RefHeading___Toc1144_4270659813"/>
+      <w:bookmarkStart w:id="20" w:name="__RefHeading___Toc1144_1191148386"/>
       <w:bookmarkEnd w:id="20"/>
       <w:r>
         <w:rPr/>
@@ -2528,7 +2528,7 @@
         <w:pStyle w:val="Heading2"/>
         <w:rPr/>
       </w:pPr>
-      <w:bookmarkStart w:id="21" w:name="__RefHeading___Toc1146_4270659813"/>
+      <w:bookmarkStart w:id="21" w:name="__RefHeading___Toc1146_1191148386"/>
       <w:bookmarkEnd w:id="21"/>
       <w:r>
         <w:rPr/>
@@ -2560,7 +2560,7 @@
         <w:pStyle w:val="Heading2"/>
         <w:rPr/>
       </w:pPr>
-      <w:bookmarkStart w:id="22" w:name="__RefHeading___Toc1148_4270659813"/>
+      <w:bookmarkStart w:id="22" w:name="__RefHeading___Toc1148_1191148386"/>
       <w:bookmarkEnd w:id="22"/>
       <w:r>
         <w:rPr/>
@@ -2582,7 +2582,7 @@
         <w:pStyle w:val="Heading2"/>
         <w:rPr/>
       </w:pPr>
-      <w:bookmarkStart w:id="23" w:name="__RefHeading___Toc1150_4270659813"/>
+      <w:bookmarkStart w:id="23" w:name="__RefHeading___Toc1150_1191148386"/>
       <w:bookmarkEnd w:id="23"/>
       <w:r>
         <w:rPr/>
@@ -2624,7 +2624,7 @@
         <w:pStyle w:val="Heading2"/>
         <w:rPr/>
       </w:pPr>
-      <w:bookmarkStart w:id="24" w:name="__RefHeading___Toc1152_4270659813"/>
+      <w:bookmarkStart w:id="24" w:name="__RefHeading___Toc1152_1191148386"/>
       <w:bookmarkEnd w:id="24"/>
       <w:r>
         <w:rPr/>
@@ -2656,7 +2656,7 @@
         <w:pStyle w:val="Heading1"/>
         <w:rPr/>
       </w:pPr>
-      <w:bookmarkStart w:id="25" w:name="__RefHeading___Toc1154_4270659813"/>
+      <w:bookmarkStart w:id="25" w:name="__RefHeading___Toc1154_1191148386"/>
       <w:bookmarkEnd w:id="25"/>
       <w:r>
         <w:rPr/>
@@ -2698,7 +2698,7 @@
         <w:pStyle w:val="Heading1"/>
         <w:rPr/>
       </w:pPr>
-      <w:bookmarkStart w:id="26" w:name="__RefHeading___Toc1156_4270659813"/>
+      <w:bookmarkStart w:id="26" w:name="__RefHeading___Toc1156_1191148386"/>
       <w:bookmarkEnd w:id="26"/>
       <w:r>
         <w:rPr/>
@@ -2710,7 +2710,7 @@
         <w:pStyle w:val="Heading2"/>
         <w:rPr/>
       </w:pPr>
-      <w:bookmarkStart w:id="27" w:name="__RefHeading___Toc1158_4270659813"/>
+      <w:bookmarkStart w:id="27" w:name="__RefHeading___Toc1158_1191148386"/>
       <w:bookmarkEnd w:id="27"/>
       <w:r>
         <w:rPr/>
@@ -2770,7 +2770,7 @@
         <w:pStyle w:val="Heading2"/>
         <w:rPr/>
       </w:pPr>
-      <w:bookmarkStart w:id="28" w:name="__RefHeading___Toc1160_4270659813"/>
+      <w:bookmarkStart w:id="28" w:name="__RefHeading___Toc1160_1191148386"/>
       <w:bookmarkEnd w:id="28"/>
       <w:r>
         <w:rPr/>
@@ -2822,7 +2822,7 @@
         <w:pStyle w:val="Heading2"/>
         <w:rPr/>
       </w:pPr>
-      <w:bookmarkStart w:id="29" w:name="__RefHeading___Toc1162_4270659813"/>
+      <w:bookmarkStart w:id="29" w:name="__RefHeading___Toc1162_1191148386"/>
       <w:bookmarkEnd w:id="29"/>
       <w:r>
         <w:rPr/>
@@ -2864,7 +2864,7 @@
         <w:pStyle w:val="Heading1"/>
         <w:rPr/>
       </w:pPr>
-      <w:bookmarkStart w:id="30" w:name="__RefHeading___Toc1164_4270659813"/>
+      <w:bookmarkStart w:id="30" w:name="__RefHeading___Toc1164_1191148386"/>
       <w:bookmarkEnd w:id="30"/>
       <w:r>
         <w:rPr/>
@@ -2876,7 +2876,7 @@
         <w:pStyle w:val="Heading2"/>
         <w:rPr/>
       </w:pPr>
-      <w:bookmarkStart w:id="31" w:name="__RefHeading___Toc1166_4270659813"/>
+      <w:bookmarkStart w:id="31" w:name="__RefHeading___Toc1166_1191148386"/>
       <w:bookmarkEnd w:id="31"/>
       <w:r>
         <w:rPr/>
@@ -2918,7 +2918,7 @@
         <w:pStyle w:val="Heading2"/>
         <w:rPr/>
       </w:pPr>
-      <w:bookmarkStart w:id="32" w:name="__RefHeading___Toc1168_4270659813"/>
+      <w:bookmarkStart w:id="32" w:name="__RefHeading___Toc1168_1191148386"/>
       <w:bookmarkEnd w:id="32"/>
       <w:r>
         <w:rPr/>
@@ -3062,7 +3062,7 @@
         <w:pStyle w:val="Heading1"/>
         <w:rPr/>
       </w:pPr>
-      <w:bookmarkStart w:id="33" w:name="__RefHeading___Toc1170_4270659813"/>
+      <w:bookmarkStart w:id="33" w:name="__RefHeading___Toc1170_1191148386"/>
       <w:bookmarkEnd w:id="33"/>
       <w:r>
         <w:rPr/>
@@ -3097,7 +3097,7 @@
         <w:pStyle w:val="Heading1"/>
         <w:rPr/>
       </w:pPr>
-      <w:bookmarkStart w:id="34" w:name="__RefHeading___Toc1172_4270659813"/>
+      <w:bookmarkStart w:id="34" w:name="__RefHeading___Toc1172_1191148386"/>
       <w:bookmarkEnd w:id="34"/>
       <w:r>
         <w:rPr/>
@@ -4627,7 +4627,7 @@
         <w:pStyle w:val="Heading1"/>
         <w:rPr/>
       </w:pPr>
-      <w:bookmarkStart w:id="35" w:name="__RefHeading___Toc1174_4270659813"/>
+      <w:bookmarkStart w:id="35" w:name="__RefHeading___Toc1174_1191148386"/>
       <w:bookmarkEnd w:id="35"/>
       <w:r>
         <w:rPr/>
@@ -4639,7 +4639,7 @@
         <w:pStyle w:val="Heading2"/>
         <w:rPr/>
       </w:pPr>
-      <w:bookmarkStart w:id="36" w:name="__RefHeading___Toc1176_4270659813"/>
+      <w:bookmarkStart w:id="36" w:name="__RefHeading___Toc1176_1191148386"/>
       <w:bookmarkEnd w:id="36"/>
       <w:r>
         <w:rPr/>
@@ -6001,7 +6001,7 @@
         <w:pStyle w:val="Heading2"/>
         <w:rPr/>
       </w:pPr>
-      <w:bookmarkStart w:id="37" w:name="__RefHeading___Toc1178_4270659813"/>
+      <w:bookmarkStart w:id="37" w:name="__RefHeading___Toc1178_1191148386"/>
       <w:bookmarkEnd w:id="37"/>
       <w:r>
         <w:rPr/>
@@ -6090,7 +6090,7 @@
         <w:pStyle w:val="Heading2"/>
         <w:rPr/>
       </w:pPr>
-      <w:bookmarkStart w:id="38" w:name="__RefHeading___Toc1180_4270659813"/>
+      <w:bookmarkStart w:id="38" w:name="__RefHeading___Toc1180_1191148386"/>
       <w:bookmarkEnd w:id="38"/>
       <w:r>
         <w:rPr/>
@@ -6679,7 +6679,7 @@
         <w:pStyle w:val="Heading2"/>
         <w:rPr/>
       </w:pPr>
-      <w:bookmarkStart w:id="39" w:name="__RefHeading___Toc1182_4270659813"/>
+      <w:bookmarkStart w:id="39" w:name="__RefHeading___Toc1182_1191148386"/>
       <w:bookmarkEnd w:id="39"/>
       <w:r>
         <w:rPr/>
@@ -6774,7 +6774,7 @@
         <w:pStyle w:val="Heading2"/>
         <w:rPr/>
       </w:pPr>
-      <w:bookmarkStart w:id="40" w:name="__RefHeading___Toc1184_4270659813"/>
+      <w:bookmarkStart w:id="40" w:name="__RefHeading___Toc1184_1191148386"/>
       <w:bookmarkEnd w:id="40"/>
       <w:r>
         <w:rPr/>

</xml_diff>